<commit_message>
feat: add 2026-09-14 daily finance report
</commit_message>
<xml_diff>
--- a/archives/2026-09-14/每日金融快讯_20260914.docx
+++ b/archives/2026-09-14/每日金融快讯_20260914.docx
@@ -217,7 +217,7 @@
         <w:t xml:space="preserve">信号灯：</w:t>
       </w:r>
       <w:r>
-        <w:t xml:space="preserve"> 走弱 </w:t>
+        <w:t xml:space="preserve"> 震荡 </w:t>
       </w:r>
       <w:r>
         <w:rPr>
@@ -1715,7 +1715,7 @@
         <w:t xml:space="preserve">信号灯：</w:t>
       </w:r>
       <w:r>
-        <w:t xml:space="preserve"> ↑升值 </w:t>
+        <w:t xml:space="preserve"> 持平 </w:t>
       </w:r>
       <w:r>
         <w:rPr>
@@ -3025,7 +3025,7 @@
         <w:t xml:space="preserve">信号灯：</w:t>
       </w:r>
       <w:r>
-        <w:t xml:space="preserve"> 收益率上行 </w:t>
+        <w:t xml:space="preserve"> 持平 </w:t>
       </w:r>
       <w:r>
         <w:rPr>

</xml_diff>